<commit_message>
feat(KTTKPM_DangNguyenTienPhat_22728941_Tuan01): Cập nhật minh chứng gửi request đến RabbitMQ Service
</commit_message>
<xml_diff>
--- a/KTTKPM_DangNguyenTienPhat_22728941_Tuan01/KTTKPM_DangNguyenTienPhat_22728941_Tuan01.docx
+++ b/KTTKPM_DangNguyenTienPhat_22728941_Tuan01/KTTKPM_DangNguyenTienPhat_22728941_Tuan01.docx
@@ -50,6 +50,7 @@
               <w:tab w:val="right" w:leader="dot" w:pos="9350"/>
             </w:tabs>
             <w:rPr>
+              <w:rFonts w:eastAsiaTheme="minorEastAsia"/>
               <w:noProof/>
             </w:rPr>
           </w:pPr>
@@ -62,7 +63,7 @@
           <w:r>
             <w:fldChar w:fldCharType="separate"/>
           </w:r>
-          <w:hyperlink w:anchor="_Toc219918374" w:history="1">
+          <w:hyperlink w:anchor="_Toc219918894" w:history="1">
             <w:r>
               <w:rPr>
                 <w:rStyle w:val="Hyperlink"/>
@@ -72,6 +73,7 @@
             </w:r>
             <w:r>
               <w:rPr>
+                <w:rFonts w:eastAsiaTheme="minorEastAsia"/>
                 <w:noProof/>
               </w:rPr>
               <w:tab/>
@@ -102,7 +104,7 @@
                 <w:noProof/>
                 <w:webHidden/>
               </w:rPr>
-              <w:instrText xml:space="preserve"> PAGEREF _Toc219918374 \h </w:instrText>
+              <w:instrText xml:space="preserve"> PAGEREF _Toc219918894 \h </w:instrText>
             </w:r>
             <w:r>
               <w:rPr>
@@ -141,19 +143,21 @@
               <w:tab w:val="right" w:leader="dot" w:pos="9350"/>
             </w:tabs>
             <w:rPr>
+              <w:rFonts w:eastAsiaTheme="minorEastAsia"/>
               <w:noProof/>
             </w:rPr>
           </w:pPr>
-          <w:hyperlink w:anchor="_Toc219918375" w:history="1">
+          <w:hyperlink w:anchor="_Toc219918895" w:history="1">
             <w:r>
               <w:rPr>
                 <w:rStyle w:val="Hyperlink"/>
                 <w:noProof/>
               </w:rPr>
-              <w:t>1.</w:t>
-            </w:r>
-            <w:r>
-              <w:rPr>
+              <w:t>2.</w:t>
+            </w:r>
+            <w:r>
+              <w:rPr>
+                <w:rFonts w:eastAsiaTheme="minorEastAsia"/>
                 <w:noProof/>
               </w:rPr>
               <w:tab/>
@@ -184,7 +188,7 @@
                 <w:noProof/>
                 <w:webHidden/>
               </w:rPr>
-              <w:instrText xml:space="preserve"> PAGEREF _Toc219918375 \h </w:instrText>
+              <w:instrText xml:space="preserve"> PAGEREF _Toc219918895 \h </w:instrText>
             </w:r>
             <w:r>
               <w:rPr>
@@ -214,8 +218,90 @@
               <w:fldChar w:fldCharType="end"/>
             </w:r>
           </w:hyperlink>
-          <w:bookmarkStart w:id="0" w:name="_GoBack"/>
-          <w:bookmarkEnd w:id="0"/>
+        </w:p>
+        <w:p>
+          <w:pPr>
+            <w:pStyle w:val="TOC2"/>
+            <w:tabs>
+              <w:tab w:val="left" w:pos="660"/>
+              <w:tab w:val="right" w:leader="dot" w:pos="9350"/>
+            </w:tabs>
+            <w:rPr>
+              <w:rFonts w:eastAsiaTheme="minorEastAsia"/>
+              <w:noProof/>
+            </w:rPr>
+          </w:pPr>
+          <w:hyperlink w:anchor="_Toc219918896" w:history="1">
+            <w:r>
+              <w:rPr>
+                <w:rStyle w:val="Hyperlink"/>
+                <w:noProof/>
+              </w:rPr>
+              <w:t>3.</w:t>
+            </w:r>
+            <w:r>
+              <w:rPr>
+                <w:rFonts w:eastAsiaTheme="minorEastAsia"/>
+                <w:noProof/>
+              </w:rPr>
+              <w:tab/>
+            </w:r>
+            <w:r>
+              <w:rPr>
+                <w:rStyle w:val="Hyperlink"/>
+                <w:noProof/>
+              </w:rPr>
+              <w:t>Gửi request tới RabbitMQ Service</w:t>
+            </w:r>
+            <w:r>
+              <w:rPr>
+                <w:noProof/>
+                <w:webHidden/>
+              </w:rPr>
+              <w:tab/>
+            </w:r>
+            <w:r>
+              <w:rPr>
+                <w:noProof/>
+                <w:webHidden/>
+              </w:rPr>
+              <w:fldChar w:fldCharType="begin"/>
+            </w:r>
+            <w:r>
+              <w:rPr>
+                <w:noProof/>
+                <w:webHidden/>
+              </w:rPr>
+              <w:instrText xml:space="preserve"> PAGEREF _Toc219918896 \h </w:instrText>
+            </w:r>
+            <w:r>
+              <w:rPr>
+                <w:noProof/>
+                <w:webHidden/>
+              </w:rPr>
+            </w:r>
+            <w:r>
+              <w:rPr>
+                <w:noProof/>
+                <w:webHidden/>
+              </w:rPr>
+              <w:fldChar w:fldCharType="separate"/>
+            </w:r>
+            <w:r>
+              <w:rPr>
+                <w:noProof/>
+                <w:webHidden/>
+              </w:rPr>
+              <w:t>4</w:t>
+            </w:r>
+            <w:r>
+              <w:rPr>
+                <w:noProof/>
+                <w:webHidden/>
+              </w:rPr>
+              <w:fldChar w:fldCharType="end"/>
+            </w:r>
+          </w:hyperlink>
         </w:p>
         <w:p>
           <w:r>
@@ -233,6 +319,8 @@
       <w:r>
         <w:br w:type="page"/>
       </w:r>
+      <w:bookmarkStart w:id="0" w:name="_GoBack"/>
+      <w:bookmarkEnd w:id="0"/>
     </w:p>
     <w:p>
       <w:pPr>
@@ -242,7 +330,7 @@
           <w:numId w:val="2"/>
         </w:numPr>
       </w:pPr>
-      <w:bookmarkStart w:id="1" w:name="_Toc219918374"/>
+      <w:bookmarkStart w:id="1" w:name="_Toc219918894"/>
       <w:r>
         <w:lastRenderedPageBreak/>
         <w:t>Khởi tạo docker compose</w:t>
@@ -372,10 +460,10 @@
         <w:pStyle w:val="Heading2"/>
         <w:numPr>
           <w:ilvl w:val="0"/>
-          <w:numId w:val="1"/>
+          <w:numId w:val="2"/>
         </w:numPr>
       </w:pPr>
-      <w:bookmarkStart w:id="2" w:name="_Toc219918375"/>
+      <w:bookmarkStart w:id="2" w:name="_Toc219918895"/>
       <w:r>
         <w:t xml:space="preserve">Truy cập </w:t>
       </w:r>
@@ -412,6 +500,99 @@
                   </pic:nvPicPr>
                   <pic:blipFill>
                     <a:blip r:embed="rId12"/>
+                    <a:stretch>
+                      <a:fillRect/>
+                    </a:stretch>
+                  </pic:blipFill>
+                  <pic:spPr>
+                    <a:xfrm>
+                      <a:off x="0" y="0"/>
+                      <a:ext cx="5943600" cy="3343275"/>
+                    </a:xfrm>
+                    <a:prstGeom prst="rect">
+                      <a:avLst/>
+                    </a:prstGeom>
+                  </pic:spPr>
+                </pic:pic>
+              </a:graphicData>
+            </a:graphic>
+          </wp:inline>
+        </w:drawing>
+      </w:r>
+    </w:p>
+    <w:p>
+      <w:pPr>
+        <w:pStyle w:val="Heading2"/>
+        <w:numPr>
+          <w:ilvl w:val="0"/>
+          <w:numId w:val="2"/>
+        </w:numPr>
+      </w:pPr>
+      <w:bookmarkStart w:id="3" w:name="_Toc219918896"/>
+      <w:r>
+        <w:lastRenderedPageBreak/>
+        <w:t>Gửi request tới RabbitMQ Service</w:t>
+      </w:r>
+      <w:bookmarkEnd w:id="3"/>
+    </w:p>
+    <w:p>
+      <w:r>
+        <w:drawing>
+          <wp:inline distT="0" distB="0" distL="0" distR="0" wp14:anchorId="0DA9B27B" wp14:editId="49419CD3">
+            <wp:extent cx="5943600" cy="3343275"/>
+            <wp:effectExtent l="0" t="0" r="0" b="9525"/>
+            <wp:docPr id="6" name="Picture 6"/>
+            <wp:cNvGraphicFramePr>
+              <a:graphicFrameLocks xmlns:a="http://schemas.openxmlformats.org/drawingml/2006/main" noChangeAspect="1"/>
+            </wp:cNvGraphicFramePr>
+            <a:graphic xmlns:a="http://schemas.openxmlformats.org/drawingml/2006/main">
+              <a:graphicData uri="http://schemas.openxmlformats.org/drawingml/2006/picture">
+                <pic:pic xmlns:pic="http://schemas.openxmlformats.org/drawingml/2006/picture">
+                  <pic:nvPicPr>
+                    <pic:cNvPr id="1" name=""/>
+                    <pic:cNvPicPr/>
+                  </pic:nvPicPr>
+                  <pic:blipFill>
+                    <a:blip r:embed="rId13"/>
+                    <a:stretch>
+                      <a:fillRect/>
+                    </a:stretch>
+                  </pic:blipFill>
+                  <pic:spPr>
+                    <a:xfrm>
+                      <a:off x="0" y="0"/>
+                      <a:ext cx="5943600" cy="3343275"/>
+                    </a:xfrm>
+                    <a:prstGeom prst="rect">
+                      <a:avLst/>
+                    </a:prstGeom>
+                  </pic:spPr>
+                </pic:pic>
+              </a:graphicData>
+            </a:graphic>
+          </wp:inline>
+        </w:drawing>
+      </w:r>
+    </w:p>
+    <w:p>
+      <w:r>
+        <w:drawing>
+          <wp:inline distT="0" distB="0" distL="0" distR="0" wp14:anchorId="498433C4" wp14:editId="15232DBC">
+            <wp:extent cx="5943600" cy="3343275"/>
+            <wp:effectExtent l="0" t="0" r="0" b="9525"/>
+            <wp:docPr id="7" name="Picture 7"/>
+            <wp:cNvGraphicFramePr>
+              <a:graphicFrameLocks xmlns:a="http://schemas.openxmlformats.org/drawingml/2006/main" noChangeAspect="1"/>
+            </wp:cNvGraphicFramePr>
+            <a:graphic xmlns:a="http://schemas.openxmlformats.org/drawingml/2006/main">
+              <a:graphicData uri="http://schemas.openxmlformats.org/drawingml/2006/picture">
+                <pic:pic xmlns:pic="http://schemas.openxmlformats.org/drawingml/2006/picture">
+                  <pic:nvPicPr>
+                    <pic:cNvPr id="1" name=""/>
+                    <pic:cNvPicPr/>
+                  </pic:nvPicPr>
+                  <pic:blipFill>
+                    <a:blip r:embed="rId14"/>
                     <a:stretch>
                       <a:fillRect/>
                     </a:stretch>
@@ -1531,7 +1712,7 @@
 </file>
 
 <file path=customXml/itemProps1.xml><?xml version="1.0" encoding="utf-8"?>
-<ds:datastoreItem xmlns:ds="http://schemas.openxmlformats.org/officeDocument/2006/customXml" ds:itemID="{1534AEAD-26F1-4F39-9C8E-CA20951C4B30}">
+<ds:datastoreItem xmlns:ds="http://schemas.openxmlformats.org/officeDocument/2006/customXml" ds:itemID="{5C27272B-0ECF-4FAA-98E6-958AA8060DBB}">
   <ds:schemaRefs>
     <ds:schemaRef ds:uri="http://schemas.openxmlformats.org/officeDocument/2006/bibliography"/>
   </ds:schemaRefs>

</xml_diff>